<commit_message>
Editor conditional-acceptance revisions (MIMIC-CXR version, citations, DUA, Zenodo)
1. State exact dataset version: MIMIC-CXR-JPG v2.1.0 (Methods 3.2 + Data Availability).
2. Add required PhysioNet citations (JPG v2.1.0 [43], MIMIC-CXR Sci Data 2019 [44],
   Goldberger Circulation 2000 [45]); cited at MIMIC-CXR mention.
3. Data Availability rewritten: credentialed-access detail + explicit confirmation
   the authors completed/signed the PhysioNet DUA; frozen predictions released for
   reproducibility.
4. Code Availability: add Zenodo DOI (placeholder pending deposit).
Adds Response-to-Editor (HTML/Word/PDF); rebuilds paperv4 Word/PDF; index links updated.

Co-Authored-By: Claude Opus 4.8 <noreply@anthropic.com>
</commit_message>
<xml_diff>
--- a/paperv4.docx
+++ b/paperv4.docx
@@ -1445,7 +1445,19 @@
         <w:widowControl w:val="1"/>
       </w:pPr>
       <w:r>
-        <w:t xml:space="preserve">The dataset aggregates chest X-ray images from MIMIC-CXR, NIH ChestX-ray14, and PadChest. Each source uses slightly different imaging protocols, labelling criteria, and patient populations, introducing domain variability. We employ two partitioning strategies. In intra-source splitting, each dataset is split independently into 80% for training and 20% for validation, with all partitions performed at the patient level so that images from the same patient are assigned exclusively to one subset, preventing leakage and reflecting deployment to previously unseen individuals.</w:t>
+        <w:t xml:space="preserve">The dataset aggregates chest X-ray images from MIMIC-CXR</w:t>
+      </w:r>
+      <w:r>
+        <w:t xml:space="preserve"> </w:t>
+      </w:r>
+      <w:r>
+        <w:rPr>
+          <w:color w:val="C00030"/>
+        </w:rPr>
+        <w:t xml:space="preserve">[44] (obtained from the MIMIC-CXR-JPG release, version 2.1.0 [43], distributed through PhysioNet [45])</w:t>
+      </w:r>
+      <w:r>
+        <w:t xml:space="preserve">, NIH ChestX-ray14, and PadChest. Each source uses slightly different imaging protocols, labelling criteria, and patient populations, introducing domain variability. We employ two partitioning strategies. In intra-source splitting, each dataset is split independently into 80% for training and 20% for validation, with all partitions performed at the patient level so that images from the same patient are assigned exclusively to one subset, preventing leakage and reflecting deployment to previously unseen individuals.</w:t>
       </w:r>
       <w:r>
         <w:t xml:space="preserve"> </w:t>
@@ -5915,7 +5927,110 @@
         <w:widowControl w:val="1"/>
       </w:pPr>
       <w:r>
-        <w:t xml:space="preserve">All datasets used in this study are publicly available. CheXpert: stanfordmlgroup.github.io/competitions/chexpert/; MIMIC-CXR-JPG: physionet.org/content/mimic-cxr-jpg/2.1.0/; NIH ChestX-ray14: nihcc.app.box.com/v/ChestXray-NIHCC; PadChest: bimcv.cipf.es/bimcv-projects/padchest/.</w:t>
+        <w:rPr>
+          <w:color w:val="C00030"/>
+        </w:rPr>
+        <w:t xml:space="preserve">This study analysed existing third-party chest-radiograph datasets and generated no new patient data. Each dataset is available from its provider under that provider's access terms.</w:t>
+      </w:r>
+      <w:r>
+        <w:t xml:space="preserve"> </w:t>
+      </w:r>
+      <w:r>
+        <w:rPr>
+          <w:b/>
+          <w:bCs/>
+          <w:color w:val="C00030"/>
+        </w:rPr>
+        <w:t xml:space="preserve">MIMIC-CXR-JPG (version 2.1.0)</w:t>
+      </w:r>
+      <w:r>
+        <w:t xml:space="preserve"> </w:t>
+      </w:r>
+      <w:r>
+        <w:rPr>
+          <w:color w:val="C00030"/>
+        </w:rPr>
+        <w:t xml:space="preserve">is distributed by PhysioNet under</w:t>
+      </w:r>
+      <w:r>
+        <w:t xml:space="preserve"> </w:t>
+      </w:r>
+      <w:r>
+        <w:rPr>
+          <w:i/>
+          <w:iCs/>
+          <w:color w:val="C00030"/>
+        </w:rPr>
+        <w:t xml:space="preserve">credentialed</w:t>
+      </w:r>
+      <w:r>
+        <w:t xml:space="preserve"> </w:t>
+      </w:r>
+      <w:r>
+        <w:rPr>
+          <w:color w:val="C00030"/>
+        </w:rPr>
+        <w:t xml:space="preserve">access (https://doi.org/10.13026/jsn5-t979): to download it, a researcher must become a credentialed PhysioNet user, complete the required human-subjects research (CITI "Data or Specimens Only Research") training, and sign the PhysioNet Credentialed Health Data Use Agreement (DUA). The authors completed this training and signed the Data Use Agreement, and used the data solely in accordance with its terms. Because the DUA prohibits redistribution, the authors cannot host the MIMIC-CXR images directly; however, any credentialed researcher can obtain the identical version 2.1.0 from PhysioNet, and, to enable verification and reproduction without re-accessing the raw images, the exact frozen per-image model predictions used for every table and figure are released with the code (see Code Availability).</w:t>
+      </w:r>
+      <w:r>
+        <w:t xml:space="preserve"> </w:t>
+      </w:r>
+      <w:r>
+        <w:rPr>
+          <w:b/>
+          <w:bCs/>
+          <w:color w:val="C00030"/>
+        </w:rPr>
+        <w:t xml:space="preserve">NIH ChestX-ray14</w:t>
+      </w:r>
+      <w:r>
+        <w:t xml:space="preserve"> </w:t>
+      </w:r>
+      <w:r>
+        <w:rPr>
+          <w:color w:val="C00030"/>
+        </w:rPr>
+        <w:t xml:space="preserve">is publicly available without restriction from the NIH Clinical Center (https://nihcc.app.box.com/v/ChestXray-NIHCC).</w:t>
+      </w:r>
+      <w:r>
+        <w:t xml:space="preserve"> </w:t>
+      </w:r>
+      <w:r>
+        <w:rPr>
+          <w:b/>
+          <w:bCs/>
+          <w:color w:val="C00030"/>
+        </w:rPr>
+        <w:t xml:space="preserve">PadChest</w:t>
+      </w:r>
+      <w:r>
+        <w:t xml:space="preserve"> </w:t>
+      </w:r>
+      <w:r>
+        <w:rPr>
+          <w:color w:val="C00030"/>
+        </w:rPr>
+        <w:t xml:space="preserve">is available from BIMCV (https://bimcv.cipf.es/bimcv-projects/padchest/) on acceptance of its data-use terms.</w:t>
+      </w:r>
+      <w:r>
+        <w:t xml:space="preserve"> </w:t>
+      </w:r>
+      <w:r>
+        <w:rPr>
+          <w:b/>
+          <w:bCs/>
+          <w:color w:val="C00030"/>
+        </w:rPr>
+        <w:t xml:space="preserve">CheXpert</w:t>
+      </w:r>
+      <w:r>
+        <w:t xml:space="preserve"> </w:t>
+      </w:r>
+      <w:r>
+        <w:rPr>
+          <w:color w:val="C00030"/>
+        </w:rPr>
+        <w:t xml:space="preserve">(used only in the released backbone's pretraining corpus, not scored in this study) is available from the Stanford Machine Learning Group (https://stanfordmlgroup.github.io/competitions/chexpert/) under its research-use agreement.</w:t>
       </w:r>
     </w:p>
     <w:bookmarkEnd w:id="54"/>
@@ -5929,7 +6044,7 @@
       </w:pPr>
       <w:r>
         <w:rPr>
-          <w:highlight w:val="yellow"/>
+          <w:color w:val="C00030"/>
         </w:rPr>
         <w:t xml:space="preserve">Code Availability</w:t>
       </w:r>
@@ -5947,6 +6062,15 @@
           <w:highlight w:val="yellow"/>
         </w:rPr>
         <w:t xml:space="preserve">Code, configuration files, and frozen per-image predictions used to reproduce every table and figure in this paper are available at github.com/ApartsinProjects/cxr-selective-rejection-code.</w:t>
+      </w:r>
+      <w:r>
+        <w:t xml:space="preserve"> </w:t>
+      </w:r>
+      <w:r>
+        <w:rPr>
+          <w:color w:val="C00030"/>
+        </w:rPr>
+        <w:t xml:space="preserve">A citable, versioned snapshot of this repository is permanently archived in the Zenodo repository under the DOI https://doi.org/10.5281/zenodo.XXXXXXX (to be replaced with the assigned DOI on deposit).</w:t>
       </w:r>
     </w:p>
     <w:bookmarkEnd w:id="55"/>
@@ -9137,6 +9261,152 @@
           <w:sz w:val="19"/>
         </w:rPr>
         <w:t xml:space="preserve">(pp. 232-243). World Scientific. https://doi.org/10.1142/9789811232701_0022</w:t>
+      </w:r>
+    </w:p>
+    <w:p>
+      <w:pPr>
+        <w:pStyle w:val="ReferenceEntry"/>
+        <w:spacing w:after="100"/>
+        <w:ind w:left="475" w:hanging="475"/>
+        <w:jc w:val="left"/>
+        <w:keepNext w:val="0"/>
+        <w:keepLines w:val="0"/>
+        <w:widowControl w:val="1"/>
+      </w:pPr>
+      <w:r>
+        <w:rPr>
+          <w:rFonts w:ascii="Georgia" w:hAnsi="Georgia"/>
+          <w:sz w:val="19"/>
+        </w:rPr>
+        <w:t xml:space="preserve">43. </w:t>
+      </w:r>
+      <w:r>
+        <w:rPr>
+          <w:color w:val="C00030"/>
+          <w:sz w:val="19"/>
+        </w:rPr>
+        <w:t xml:space="preserve">Johnson, A., Lungren, M., Peng, Y., Lu, Z., Mark, R., Berkowitz, S., &amp; Horng, S. (2024).</w:t>
+      </w:r>
+      <w:r>
+        <w:rPr>
+          <w:sz w:val="19"/>
+        </w:rPr>
+        <w:t xml:space="preserve"> </w:t>
+      </w:r>
+      <w:r>
+        <w:rPr>
+          <w:i/>
+          <w:iCs/>
+          <w:sz w:val="19"/>
+        </w:rPr>
+        <w:t xml:space="preserve">MIMIC-CXR-JPG — chest radiographs with structured labels</w:t>
+      </w:r>
+      <w:r>
+        <w:rPr>
+          <w:sz w:val="19"/>
+        </w:rPr>
+        <w:t xml:space="preserve"> </w:t>
+      </w:r>
+      <w:r>
+        <w:rPr>
+          <w:color w:val="C00030"/>
+          <w:sz w:val="19"/>
+        </w:rPr>
+        <w:t xml:space="preserve">(version 2.1.0) [Data set]. PhysioNet. RRID:SCR_007345. https://doi.org/10.13026/jsn5-t979</w:t>
+      </w:r>
+    </w:p>
+    <w:p>
+      <w:pPr>
+        <w:pStyle w:val="ReferenceEntry"/>
+        <w:spacing w:after="100"/>
+        <w:ind w:left="475" w:hanging="475"/>
+        <w:jc w:val="left"/>
+        <w:keepNext w:val="0"/>
+        <w:keepLines w:val="0"/>
+        <w:widowControl w:val="1"/>
+      </w:pPr>
+      <w:r>
+        <w:rPr>
+          <w:rFonts w:ascii="Georgia" w:hAnsi="Georgia"/>
+          <w:sz w:val="19"/>
+        </w:rPr>
+        <w:t xml:space="preserve">44. </w:t>
+      </w:r>
+      <w:r>
+        <w:rPr>
+          <w:color w:val="C00030"/>
+          <w:sz w:val="19"/>
+        </w:rPr>
+        <w:t xml:space="preserve">Johnson, A. E. W., Pollard, T. J., Berkowitz, S. J., Greenbaum, N. R., Lungren, M. P., Deng, C.-Y., Mark, R. G., &amp; Horng, S. (2019). MIMIC-CXR, a de-identified publicly available database of chest radiographs with free-text reports.</w:t>
+      </w:r>
+      <w:r>
+        <w:rPr>
+          <w:sz w:val="19"/>
+        </w:rPr>
+        <w:t xml:space="preserve"> </w:t>
+      </w:r>
+      <w:r>
+        <w:rPr>
+          <w:i/>
+          <w:iCs/>
+          <w:color w:val="C00030"/>
+          <w:sz w:val="19"/>
+        </w:rPr>
+        <w:t xml:space="preserve">Scientific Data, 6</w:t>
+      </w:r>
+      <w:r>
+        <w:rPr>
+          <w:color w:val="C00030"/>
+          <w:sz w:val="19"/>
+        </w:rPr>
+        <w:t xml:space="preserve">, 317. https://doi.org/10.1038/s41597-019-0322-0</w:t>
+      </w:r>
+    </w:p>
+    <w:p>
+      <w:pPr>
+        <w:pStyle w:val="ReferenceEntry"/>
+        <w:spacing w:after="100"/>
+        <w:ind w:left="475" w:hanging="475"/>
+        <w:jc w:val="left"/>
+        <w:keepNext w:val="0"/>
+        <w:keepLines w:val="0"/>
+        <w:widowControl w:val="1"/>
+      </w:pPr>
+      <w:r>
+        <w:rPr>
+          <w:rFonts w:ascii="Georgia" w:hAnsi="Georgia"/>
+          <w:sz w:val="19"/>
+        </w:rPr>
+        <w:t xml:space="preserve">45. </w:t>
+      </w:r>
+      <w:r>
+        <w:rPr>
+          <w:color w:val="C00030"/>
+          <w:sz w:val="19"/>
+        </w:rPr>
+        <w:t xml:space="preserve">Goldberger, A. L., Amaral, L. A. N., Glass, L., Hausdorff, J. M., Ivanov, P. Ch., Mark, R. G., Mietus, J. E., Moody, G. B., Peng, C.-K., &amp; Stanley, H. E. (2000). PhysioBank, PhysioToolkit, and PhysioNet: Components of a new research resource for complex physiologic signals.</w:t>
+      </w:r>
+      <w:r>
+        <w:rPr>
+          <w:sz w:val="19"/>
+        </w:rPr>
+        <w:t xml:space="preserve"> </w:t>
+      </w:r>
+      <w:r>
+        <w:rPr>
+          <w:i/>
+          <w:iCs/>
+          <w:color w:val="C00030"/>
+          <w:sz w:val="19"/>
+        </w:rPr>
+        <w:t xml:space="preserve">Circulation, 101</w:t>
+      </w:r>
+      <w:r>
+        <w:rPr>
+          <w:color w:val="C00030"/>
+          <w:sz w:val="19"/>
+        </w:rPr>
+        <w:t xml:space="preserve">(23), e215-e220. https://doi.org/10.1161/01.CIR.101.23.e215</w:t>
       </w:r>
     </w:p>
     <w:bookmarkEnd w:id="59"/>

</xml_diff>